<commit_message>
Ajuste de archivos y rutas
</commit_message>
<xml_diff>
--- a/PlantillasActualizadas/CONTRATO_DE_APRENDIZAJE_LECTIVA.docx
+++ b/PlantillasActualizadas/CONTRATO_DE_APRENDIZAJE_LECTIVA.docx
@@ -288,6 +288,7 @@
                 <w:rFonts w:ascii="Tahoma" w:eastAsia="Tahoma" w:hAnsi="Tahoma" w:cs="Tahoma"/>
                 <w:sz w:val="20"/>
                 <w:szCs w:val="20"/>
+                <w:u w:val="single"/>
               </w:rPr>
             </w:pPr>
             <w:r>
@@ -298,16 +299,14 @@
               </w:rPr>
               <w:t>{{</w:t>
             </w:r>
-            <w:proofErr w:type="spellStart"/>
             <w:r>
               <w:rPr>
                 <w:rFonts w:ascii="Tahoma" w:eastAsia="Tahoma" w:hAnsi="Tahoma" w:cs="Tahoma"/>
                 <w:sz w:val="20"/>
                 <w:szCs w:val="20"/>
               </w:rPr>
-              <w:t>dirreccion</w:t>
+              <w:t>direccion</w:t>
             </w:r>
-            <w:proofErr w:type="spellEnd"/>
             <w:r>
               <w:rPr>
                 <w:rFonts w:ascii="Tahoma" w:eastAsia="Tahoma" w:hAnsi="Tahoma" w:cs="Tahoma"/>
@@ -394,7 +393,6 @@
               </w:rPr>
               <w:t>{{</w:t>
             </w:r>
-            <w:proofErr w:type="spellStart"/>
             <w:r>
               <w:rPr>
                 <w:rFonts w:ascii="Tahoma" w:eastAsia="Tahoma" w:hAnsi="Tahoma" w:cs="Tahoma"/>
@@ -403,7 +401,6 @@
               </w:rPr>
               <w:t>telefono</w:t>
             </w:r>
-            <w:proofErr w:type="spellEnd"/>
             <w:r>
               <w:rPr>
                 <w:rFonts w:ascii="Tahoma" w:eastAsia="Tahoma" w:hAnsi="Tahoma" w:cs="Tahoma"/>
@@ -514,25 +511,7 @@
                 <w:sz w:val="20"/>
                 <w:szCs w:val="20"/>
               </w:rPr>
-              <w:t>{{</w:t>
-            </w:r>
-            <w:proofErr w:type="spellStart"/>
-            <w:r>
-              <w:rPr>
-                <w:rFonts w:ascii="Tahoma" w:eastAsia="Tahoma" w:hAnsi="Tahoma" w:cs="Tahoma"/>
-                <w:sz w:val="20"/>
-                <w:szCs w:val="20"/>
-              </w:rPr>
-              <w:t>arl</w:t>
-            </w:r>
-            <w:proofErr w:type="spellEnd"/>
-            <w:r>
-              <w:rPr>
-                <w:rFonts w:ascii="Tahoma" w:eastAsia="Tahoma" w:hAnsi="Tahoma" w:cs="Tahoma"/>
-                <w:sz w:val="20"/>
-                <w:szCs w:val="20"/>
-              </w:rPr>
-              <w:t>}}</w:t>
+              <w:t>{{arl}}</w:t>
             </w:r>
           </w:p>
         </w:tc>
@@ -584,25 +563,7 @@
                 <w:sz w:val="20"/>
                 <w:szCs w:val="20"/>
               </w:rPr>
-              <w:t>{{</w:t>
-            </w:r>
-            <w:proofErr w:type="spellStart"/>
-            <w:r>
-              <w:rPr>
-                <w:rFonts w:ascii="Tahoma" w:eastAsia="Tahoma" w:hAnsi="Tahoma" w:cs="Tahoma"/>
-                <w:sz w:val="20"/>
-                <w:szCs w:val="20"/>
-              </w:rPr>
-              <w:t>eps</w:t>
-            </w:r>
-            <w:proofErr w:type="spellEnd"/>
-            <w:r>
-              <w:rPr>
-                <w:rFonts w:ascii="Tahoma" w:eastAsia="Tahoma" w:hAnsi="Tahoma" w:cs="Tahoma"/>
-                <w:sz w:val="20"/>
-                <w:szCs w:val="20"/>
-              </w:rPr>
-              <w:t>}}</w:t>
+              <w:t>{{eps}}</w:t>
             </w:r>
           </w:p>
         </w:tc>
@@ -823,16 +784,14 @@
               </w:rPr>
               <w:t>{{</w:t>
             </w:r>
-            <w:proofErr w:type="spellStart"/>
             <w:r>
               <w:rPr>
                 <w:rFonts w:ascii="Tahoma" w:eastAsia="Tahoma" w:hAnsi="Tahoma" w:cs="Tahoma"/>
                 <w:sz w:val="20"/>
                 <w:szCs w:val="20"/>
               </w:rPr>
-              <w:t>FechaSuscripcion</w:t>
+              <w:t>fecha_suscripcion</w:t>
             </w:r>
-            <w:proofErr w:type="spellEnd"/>
             <w:r>
               <w:rPr>
                 <w:rFonts w:ascii="Tahoma" w:eastAsia="Tahoma" w:hAnsi="Tahoma" w:cs="Tahoma"/>
@@ -896,7 +855,6 @@
               </w:rPr>
               <w:t>{{</w:t>
             </w:r>
-            <w:proofErr w:type="spellStart"/>
             <w:r>
               <w:rPr>
                 <w:rFonts w:ascii="Tahoma" w:eastAsia="Tahoma" w:hAnsi="Tahoma" w:cs="Tahoma"/>
@@ -905,7 +863,6 @@
               </w:rPr>
               <w:t>fechaterminacion</w:t>
             </w:r>
-            <w:proofErr w:type="spellEnd"/>
             <w:r>
               <w:rPr>
                 <w:rFonts w:ascii="Tahoma" w:eastAsia="Tahoma" w:hAnsi="Tahoma" w:cs="Tahoma"/>
@@ -969,27 +926,7 @@
                 <w:szCs w:val="20"/>
                 <w:highlight w:val="white"/>
               </w:rPr>
-              <w:t>{{</w:t>
-            </w:r>
-            <w:proofErr w:type="spellStart"/>
-            <w:r>
-              <w:rPr>
-                <w:rFonts w:ascii="Tahoma" w:eastAsia="Tahoma" w:hAnsi="Tahoma" w:cs="Tahoma"/>
-                <w:sz w:val="20"/>
-                <w:szCs w:val="20"/>
-                <w:highlight w:val="white"/>
-              </w:rPr>
-              <w:t>centroSena</w:t>
-            </w:r>
-            <w:proofErr w:type="spellEnd"/>
-            <w:r>
-              <w:rPr>
-                <w:rFonts w:ascii="Tahoma" w:eastAsia="Tahoma" w:hAnsi="Tahoma" w:cs="Tahoma"/>
-                <w:sz w:val="20"/>
-                <w:szCs w:val="20"/>
-                <w:highlight w:val="white"/>
-              </w:rPr>
-              <w:t>}}</w:t>
+              <w:t>{{centroSena}}</w:t>
             </w:r>
           </w:p>
         </w:tc>
@@ -2246,40 +2183,18 @@
           <w:sz w:val="20"/>
           <w:szCs w:val="20"/>
         </w:rPr>
-        <w:t xml:space="preserve">. Durante la etapa lectiva, </w:t>
-      </w:r>
-      <w:proofErr w:type="gramStart"/>
-      <w:r>
-        <w:rPr>
-          <w:rFonts w:ascii="Tahoma" w:eastAsia="Tahoma" w:hAnsi="Tahoma" w:cs="Tahoma"/>
-          <w:color w:val="000000"/>
-          <w:sz w:val="20"/>
-          <w:szCs w:val="20"/>
-        </w:rPr>
-        <w:t xml:space="preserve">el </w:t>
-      </w:r>
-      <w:r>
-        <w:rPr>
-          <w:rFonts w:ascii="Tahoma" w:eastAsia="Tahoma" w:hAnsi="Tahoma" w:cs="Tahoma"/>
-          <w:b/>
-          <w:bCs/>
-          <w:color w:val="000000"/>
-          <w:sz w:val="20"/>
-          <w:szCs w:val="20"/>
-        </w:rPr>
-        <w:t xml:space="preserve"> APRENDIZ</w:t>
-      </w:r>
-      <w:proofErr w:type="gramEnd"/>
-      <w:r>
-        <w:rPr>
-          <w:rFonts w:ascii="Tahoma" w:eastAsia="Tahoma" w:hAnsi="Tahoma" w:cs="Tahoma"/>
-          <w:b/>
-          <w:bCs/>
-          <w:color w:val="000000"/>
-          <w:sz w:val="20"/>
-          <w:szCs w:val="20"/>
-        </w:rPr>
-        <w:t xml:space="preserve"> </w:t>
+        <w:t xml:space="preserve">. Durante la etapa lectiva, el </w:t>
+      </w:r>
+      <w:r>
+        <w:rPr>
+          <w:rFonts w:ascii="Tahoma" w:eastAsia="Tahoma" w:hAnsi="Tahoma" w:cs="Tahoma"/>
+          <w:b/>
+          <w:bCs/>
+          <w:color w:val="000000"/>
+          <w:sz w:val="20"/>
+          <w:szCs w:val="20"/>
+        </w:rPr>
+        <w:t xml:space="preserve"> APRENDIZ </w:t>
       </w:r>
       <w:r>
         <w:rPr>
@@ -2499,43 +2414,7 @@
           <w:sz w:val="20"/>
           <w:szCs w:val="20"/>
         </w:rPr>
-        <w:t xml:space="preserve"> para que realice cualquier operación de tratamiento sobre sus datos personales con las siguientes finalidades: (i) envío de correspondencia, email, mensajes de texto con relación a la ejecución de mis actividades académicas, (</w:t>
-      </w:r>
-      <w:proofErr w:type="spellStart"/>
-      <w:r>
-        <w:rPr>
-          <w:rFonts w:ascii="Tahoma" w:eastAsia="Tahoma" w:hAnsi="Tahoma" w:cs="Tahoma"/>
-          <w:sz w:val="20"/>
-          <w:szCs w:val="20"/>
-        </w:rPr>
-        <w:t>ii</w:t>
-      </w:r>
-      <w:proofErr w:type="spellEnd"/>
-      <w:r>
-        <w:rPr>
-          <w:rFonts w:ascii="Tahoma" w:eastAsia="Tahoma" w:hAnsi="Tahoma" w:cs="Tahoma"/>
-          <w:sz w:val="20"/>
-          <w:szCs w:val="20"/>
-        </w:rPr>
-        <w:t>) Suministro de información a las autoridades competentes en caso de que estas la requieran (</w:t>
-      </w:r>
-      <w:proofErr w:type="spellStart"/>
-      <w:r>
-        <w:rPr>
-          <w:rFonts w:ascii="Tahoma" w:eastAsia="Tahoma" w:hAnsi="Tahoma" w:cs="Tahoma"/>
-          <w:sz w:val="20"/>
-          <w:szCs w:val="20"/>
-        </w:rPr>
-        <w:t>iii</w:t>
-      </w:r>
-      <w:proofErr w:type="spellEnd"/>
-      <w:r>
-        <w:rPr>
-          <w:rFonts w:ascii="Tahoma" w:eastAsia="Tahoma" w:hAnsi="Tahoma" w:cs="Tahoma"/>
-          <w:sz w:val="20"/>
-          <w:szCs w:val="20"/>
-        </w:rPr>
-        <w:t xml:space="preserve">) con el propósito que la información sea almacenada por terceros encargados del centro de formación. </w:t>
+        <w:t xml:space="preserve"> para que realice cualquier operación de tratamiento sobre sus datos personales con las siguientes finalidades: (i) envío de correspondencia, email, mensajes de texto con relación a la ejecución de mis actividades académicas, (ii) Suministro de información a las autoridades competentes en caso de que estas la requieran (iii) con el propósito que la información sea almacenada por terceros encargados del centro de formación. </w:t>
       </w:r>
     </w:p>
     <w:p>
@@ -2950,27 +2829,15 @@
           <w:szCs w:val="20"/>
         </w:rPr>
       </w:pPr>
-      <w:proofErr w:type="spellStart"/>
-      <w:r>
-        <w:rPr>
-          <w:rFonts w:ascii="Tahoma" w:eastAsia="Tahoma" w:hAnsi="Tahoma" w:cs="Tahoma"/>
-          <w:b/>
-          <w:bCs/>
-          <w:sz w:val="20"/>
-          <w:szCs w:val="20"/>
-        </w:rPr>
-        <w:t>Nit</w:t>
-      </w:r>
-      <w:proofErr w:type="spellEnd"/>
-      <w:r>
-        <w:rPr>
-          <w:rFonts w:ascii="Tahoma" w:eastAsia="Tahoma" w:hAnsi="Tahoma" w:cs="Tahoma"/>
-          <w:b/>
-          <w:bCs/>
-          <w:sz w:val="20"/>
-          <w:szCs w:val="20"/>
-        </w:rPr>
-        <w:t>.</w:t>
+      <w:r>
+        <w:rPr>
+          <w:rFonts w:ascii="Tahoma" w:eastAsia="Tahoma" w:hAnsi="Tahoma" w:cs="Tahoma"/>
+          <w:b/>
+          <w:bCs/>
+          <w:sz w:val="20"/>
+          <w:szCs w:val="20"/>
+        </w:rPr>
+        <w:t>Nit.</w:t>
       </w:r>
       <w:r>
         <w:rPr>

</xml_diff>